<commit_message>
Project college doc update
</commit_message>
<xml_diff>
--- a/Useless_Shit_Donotopen/PBL 2 Project Abstract.docx
+++ b/Useless_Shit_Donotopen/PBL 2 Project Abstract.docx
@@ -1,6 +1,6 @@
 
 <file path=word/document.xml><?xml version="1.0" encoding="utf-8"?>
-<w:document xmlns:wpc="http://schemas.microsoft.com/office/word/2010/wordprocessingCanvas" xmlns:cx="http://schemas.microsoft.com/office/drawing/2014/chartex" xmlns:cx1="http://schemas.microsoft.com/office/drawing/2015/9/8/chartex" xmlns:cx2="http://schemas.microsoft.com/office/drawing/2015/10/21/chartex" xmlns:cx3="http://schemas.microsoft.com/office/drawing/2016/5/9/chartex" xmlns:cx4="http://schemas.microsoft.com/office/drawing/2016/5/10/chartex" xmlns:cx5="http://schemas.microsoft.com/office/drawing/2016/5/11/chartex" xmlns:cx6="http://schemas.microsoft.com/office/drawing/2016/5/12/chartex" xmlns:cx7="http://schemas.microsoft.com/office/drawing/2016/5/13/chartex" xmlns:cx8="http://schemas.microsoft.com/office/drawing/2016/5/14/chartex" xmlns:mc="http://schemas.openxmlformats.org/markup-compatibility/2006" xmlns:aink="http://schemas.microsoft.com/office/drawing/2016/ink" xmlns:am3d="http://schemas.microsoft.com/office/drawing/2017/model3d" xmlns:o="urn:schemas-microsoft-com:office:office" xmlns:oel="http://schemas.microsoft.com/office/2019/extlst" xmlns:r="http://schemas.openxmlformats.org/officeDocument/2006/relationships" xmlns:m="http://schemas.openxmlformats.org/officeDocument/2006/math" xmlns:v="urn:schemas-microsoft-com:vml" xmlns:wp14="http://schemas.microsoft.com/office/word/2010/wordprocessingDrawing" xmlns:wp="http://schemas.openxmlformats.org/drawingml/2006/wordprocessingDrawing" xmlns:w10="urn:schemas-microsoft-com:office:word" xmlns:w="http://schemas.openxmlformats.org/wordprocessingml/2006/main" xmlns:w14="http://schemas.microsoft.com/office/word/2010/wordml" xmlns:w15="http://schemas.microsoft.com/office/word/2012/wordml" xmlns:w16cex="http://schemas.microsoft.com/office/word/2018/wordml/cex" xmlns:w16cid="http://schemas.microsoft.com/office/word/2016/wordml/cid" xmlns:w16="http://schemas.microsoft.com/office/word/2018/wordml" xmlns:w16du="http://schemas.microsoft.com/office/word/2023/wordml/word16du" xmlns:w16sdtdh="http://schemas.microsoft.com/office/word/2020/wordml/sdtdatahash" xmlns:w16sdtfl="http://schemas.microsoft.com/office/word/2024/wordml/sdtformatlock" xmlns:w16se="http://schemas.microsoft.com/office/word/2015/wordml/symex" xmlns:wpg="http://schemas.microsoft.com/office/word/2010/wordprocessingGroup" xmlns:wpi="http://schemas.microsoft.com/office/word/2010/wordprocessingInk" xmlns:wne="http://schemas.microsoft.com/office/word/2006/wordml" xmlns:wps="http://schemas.microsoft.com/office/word/2010/wordprocessingShape" mc:Ignorable="w14 w15 w16se w16cid w16 w16cex w16sdtdh w16sdtfl w16du wp14">
+<w:document xmlns:wpc="http://schemas.microsoft.com/office/word/2010/wordprocessingCanvas" xmlns:cx="http://schemas.microsoft.com/office/drawing/2014/chartex" xmlns:cx1="http://schemas.microsoft.com/office/drawing/2015/9/8/chartex" xmlns:cx2="http://schemas.microsoft.com/office/drawing/2015/10/21/chartex" xmlns:cx3="http://schemas.microsoft.com/office/drawing/2016/5/9/chartex" xmlns:cx4="http://schemas.microsoft.com/office/drawing/2016/5/10/chartex" xmlns:cx5="http://schemas.microsoft.com/office/drawing/2016/5/11/chartex" xmlns:cx6="http://schemas.microsoft.com/office/drawing/2016/5/12/chartex" xmlns:cx7="http://schemas.microsoft.com/office/drawing/2016/5/13/chartex" xmlns:cx8="http://schemas.microsoft.com/office/drawing/2016/5/14/chartex" xmlns:mc="http://schemas.openxmlformats.org/markup-compatibility/2006" xmlns:m="http://schemas.openxmlformats.org/officeDocument/2006/math" xmlns:aink="http://schemas.microsoft.com/office/drawing/2016/ink" xmlns:am3d="http://schemas.microsoft.com/office/drawing/2017/model3d" xmlns:oel="http://schemas.microsoft.com/office/2019/extlst" xmlns:r="http://schemas.openxmlformats.org/officeDocument/2006/relationships" xmlns:wp14="http://schemas.microsoft.com/office/word/2010/wordprocessingDrawing" xmlns:wp="http://schemas.openxmlformats.org/drawingml/2006/wordprocessingDrawing" xmlns:wpg="http://schemas.microsoft.com/office/word/2010/wordprocessingGroup" xmlns:wpi="http://schemas.microsoft.com/office/word/2010/wordprocessingInk" xmlns:wps="http://schemas.microsoft.com/office/word/2010/wordprocessingShape" xmlns:o="urn:schemas-microsoft-com:office:office" xmlns:v="urn:schemas-microsoft-com:vml" xmlns:w10="urn:schemas-microsoft-com:office:word" xmlns:w="http://schemas.openxmlformats.org/wordprocessingml/2006/main" xmlns:w14="http://schemas.microsoft.com/office/word/2010/wordml" xmlns:w15="http://schemas.microsoft.com/office/word/2012/wordml" xmlns:w16cex="http://schemas.microsoft.com/office/word/2018/wordml/cex" xmlns:w16cid="http://schemas.microsoft.com/office/word/2016/wordml/cid" xmlns:w16="http://schemas.microsoft.com/office/word/2018/wordml" xmlns:w16sdtdh="http://schemas.microsoft.com/office/word/2020/wordml/sdtdatahash" xmlns:w16sdtfl="http://schemas.microsoft.com/office/word/2024/wordml/sdtformatlock" xmlns:w16se="http://schemas.microsoft.com/office/word/2015/wordml/symex" xmlns:w16du="http://schemas.microsoft.com/office/word/2023/wordml/word16du" xmlns:wne="http://schemas.microsoft.com/office/word/2006/wordml" mc:Ignorable="w14 w15 w16se w16cid w16 w16cex w16sdtdh w16sdtfl w16du wp14">
   <w:body>
     <w:p>
       <w:pPr>
@@ -1903,7 +1903,7 @@
       <w:pPr>
         <w:pStyle w:val="BodyText"/>
         <w:spacing w:before="279"/>
-        <w:ind w:right="1815"/>
+        <w:ind w:right="360"/>
         <w:jc w:val="center"/>
         <w:rPr>
           <w:bCs/>
@@ -1915,10 +1915,10 @@
           <w:noProof/>
         </w:rPr>
         <w:drawing>
-          <wp:inline distT="0" distB="0" distL="0" distR="0" wp14:anchorId="3AB7DE6B" wp14:editId="4DD4BDE1">
-            <wp:extent cx="4222352" cy="8366760"/>
-            <wp:effectExtent l="0" t="0" r="6985" b="0"/>
-            <wp:docPr id="1287696685" name="Picture 3"/>
+          <wp:inline distT="0" distB="0" distL="0" distR="0" wp14:anchorId="34812C50" wp14:editId="0BA40621">
+            <wp:extent cx="4094269" cy="8115300"/>
+            <wp:effectExtent l="0" t="0" r="0" b="0"/>
+            <wp:docPr id="273936128" name="Picture 4"/>
             <wp:cNvGraphicFramePr>
               <a:graphicFrameLocks xmlns:a="http://schemas.openxmlformats.org/drawingml/2006/main" noChangeAspect="1"/>
             </wp:cNvGraphicFramePr>
@@ -1926,14 +1926,14 @@
               <a:graphicData uri="http://schemas.openxmlformats.org/drawingml/2006/picture">
                 <pic:pic xmlns:pic="http://schemas.openxmlformats.org/drawingml/2006/picture">
                   <pic:nvPicPr>
-                    <pic:cNvPr id="1287696685" name="Picture 1287696685"/>
+                    <pic:cNvPr id="273936128" name="Picture 273936128"/>
                     <pic:cNvPicPr/>
                   </pic:nvPicPr>
                   <pic:blipFill>
-                    <a:blip r:embed="rId7" cstate="print">
+                    <a:blip r:embed="rId7" cstate="hqprint">
                       <a:extLst>
                         <a:ext uri="{28A0092B-C50C-407E-A947-70E740481C1C}">
-                          <a14:useLocalDpi xmlns:a14="http://schemas.microsoft.com/office/drawing/2010/main" val="0"/>
+                          <a14:useLocalDpi xmlns:a14="http://schemas.microsoft.com/office/drawing/2010/main"/>
                         </a:ext>
                       </a:extLst>
                     </a:blip>
@@ -1944,7 +1944,7 @@
                   <pic:spPr>
                     <a:xfrm>
                       <a:off x="0" y="0"/>
-                      <a:ext cx="4236479" cy="8394753"/>
+                      <a:ext cx="4102356" cy="8131329"/>
                     </a:xfrm>
                     <a:prstGeom prst="rect">
                       <a:avLst/>
@@ -1967,7 +1967,7 @@
 </file>
 
 <file path=word/numbering.xml><?xml version="1.0" encoding="utf-8"?>
-<w:numbering xmlns:wpc="http://schemas.microsoft.com/office/word/2010/wordprocessingCanvas" xmlns:cx="http://schemas.microsoft.com/office/drawing/2014/chartex" xmlns:cx1="http://schemas.microsoft.com/office/drawing/2015/9/8/chartex" xmlns:cx2="http://schemas.microsoft.com/office/drawing/2015/10/21/chartex" xmlns:cx3="http://schemas.microsoft.com/office/drawing/2016/5/9/chartex" xmlns:cx4="http://schemas.microsoft.com/office/drawing/2016/5/10/chartex" xmlns:cx5="http://schemas.microsoft.com/office/drawing/2016/5/11/chartex" xmlns:cx6="http://schemas.microsoft.com/office/drawing/2016/5/12/chartex" xmlns:cx7="http://schemas.microsoft.com/office/drawing/2016/5/13/chartex" xmlns:cx8="http://schemas.microsoft.com/office/drawing/2016/5/14/chartex" xmlns:mc="http://schemas.openxmlformats.org/markup-compatibility/2006" xmlns:aink="http://schemas.microsoft.com/office/drawing/2016/ink" xmlns:am3d="http://schemas.microsoft.com/office/drawing/2017/model3d" xmlns:o="urn:schemas-microsoft-com:office:office" xmlns:oel="http://schemas.microsoft.com/office/2019/extlst" xmlns:r="http://schemas.openxmlformats.org/officeDocument/2006/relationships" xmlns:m="http://schemas.openxmlformats.org/officeDocument/2006/math" xmlns:v="urn:schemas-microsoft-com:vml" xmlns:wp14="http://schemas.microsoft.com/office/word/2010/wordprocessingDrawing" xmlns:wp="http://schemas.openxmlformats.org/drawingml/2006/wordprocessingDrawing" xmlns:w10="urn:schemas-microsoft-com:office:word" xmlns:w="http://schemas.openxmlformats.org/wordprocessingml/2006/main" xmlns:w14="http://schemas.microsoft.com/office/word/2010/wordml" xmlns:w15="http://schemas.microsoft.com/office/word/2012/wordml" xmlns:w16cex="http://schemas.microsoft.com/office/word/2018/wordml/cex" xmlns:w16cid="http://schemas.microsoft.com/office/word/2016/wordml/cid" xmlns:w16="http://schemas.microsoft.com/office/word/2018/wordml" xmlns:w16du="http://schemas.microsoft.com/office/word/2023/wordml/word16du" xmlns:w16sdtdh="http://schemas.microsoft.com/office/word/2020/wordml/sdtdatahash" xmlns:w16sdtfl="http://schemas.microsoft.com/office/word/2024/wordml/sdtformatlock" xmlns:w16se="http://schemas.microsoft.com/office/word/2015/wordml/symex" xmlns:wpg="http://schemas.microsoft.com/office/word/2010/wordprocessingGroup" xmlns:wpi="http://schemas.microsoft.com/office/word/2010/wordprocessingInk" xmlns:wne="http://schemas.microsoft.com/office/word/2006/wordml" xmlns:wps="http://schemas.microsoft.com/office/word/2010/wordprocessingShape" mc:Ignorable="w14 w15 w16se w16cid w16 w16cex w16sdtdh w16sdtfl w16du wp14">
+<w:numbering xmlns:wpc="http://schemas.microsoft.com/office/word/2010/wordprocessingCanvas" xmlns:cx="http://schemas.microsoft.com/office/drawing/2014/chartex" xmlns:cx1="http://schemas.microsoft.com/office/drawing/2015/9/8/chartex" xmlns:cx2="http://schemas.microsoft.com/office/drawing/2015/10/21/chartex" xmlns:cx3="http://schemas.microsoft.com/office/drawing/2016/5/9/chartex" xmlns:cx4="http://schemas.microsoft.com/office/drawing/2016/5/10/chartex" xmlns:cx5="http://schemas.microsoft.com/office/drawing/2016/5/11/chartex" xmlns:cx6="http://schemas.microsoft.com/office/drawing/2016/5/12/chartex" xmlns:cx7="http://schemas.microsoft.com/office/drawing/2016/5/13/chartex" xmlns:cx8="http://schemas.microsoft.com/office/drawing/2016/5/14/chartex" xmlns:mc="http://schemas.openxmlformats.org/markup-compatibility/2006" xmlns:m="http://schemas.openxmlformats.org/officeDocument/2006/math" xmlns:aink="http://schemas.microsoft.com/office/drawing/2016/ink" xmlns:am3d="http://schemas.microsoft.com/office/drawing/2017/model3d" xmlns:oel="http://schemas.microsoft.com/office/2019/extlst" xmlns:r="http://schemas.openxmlformats.org/officeDocument/2006/relationships" xmlns:wp14="http://schemas.microsoft.com/office/word/2010/wordprocessingDrawing" xmlns:wp="http://schemas.openxmlformats.org/drawingml/2006/wordprocessingDrawing" xmlns:wpg="http://schemas.microsoft.com/office/word/2010/wordprocessingGroup" xmlns:wpi="http://schemas.microsoft.com/office/word/2010/wordprocessingInk" xmlns:wps="http://schemas.microsoft.com/office/word/2010/wordprocessingShape" xmlns:o="urn:schemas-microsoft-com:office:office" xmlns:v="urn:schemas-microsoft-com:vml" xmlns:w10="urn:schemas-microsoft-com:office:word" xmlns:w="http://schemas.openxmlformats.org/wordprocessingml/2006/main" xmlns:w14="http://schemas.microsoft.com/office/word/2010/wordml" xmlns:w15="http://schemas.microsoft.com/office/word/2012/wordml" xmlns:w16cex="http://schemas.microsoft.com/office/word/2018/wordml/cex" xmlns:w16cid="http://schemas.microsoft.com/office/word/2016/wordml/cid" xmlns:w16="http://schemas.microsoft.com/office/word/2018/wordml" xmlns:w16sdtdh="http://schemas.microsoft.com/office/word/2020/wordml/sdtdatahash" xmlns:w16sdtfl="http://schemas.microsoft.com/office/word/2024/wordml/sdtformatlock" xmlns:w16se="http://schemas.microsoft.com/office/word/2015/wordml/symex" xmlns:w16du="http://schemas.microsoft.com/office/word/2023/wordml/word16du" xmlns:wne="http://schemas.microsoft.com/office/word/2006/wordml" mc:Ignorable="w14 w15 w16se w16cid w16 w16cex w16sdtdh w16sdtfl w16du wp14">
   <w:abstractNum w:abstractNumId="0" w15:restartNumberingAfterBreak="0">
     <w:nsid w:val="574E0F28"/>
     <w:multiLevelType w:val="multilevel"/>
@@ -2213,7 +2213,7 @@
 </file>
 
 <file path=word/styles.xml><?xml version="1.0" encoding="utf-8"?>
-<w:styles xmlns:mc="http://schemas.openxmlformats.org/markup-compatibility/2006" xmlns:r="http://schemas.openxmlformats.org/officeDocument/2006/relationships" xmlns:w="http://schemas.openxmlformats.org/wordprocessingml/2006/main" xmlns:w14="http://schemas.microsoft.com/office/word/2010/wordml" xmlns:w15="http://schemas.microsoft.com/office/word/2012/wordml" xmlns:w16cex="http://schemas.microsoft.com/office/word/2018/wordml/cex" xmlns:w16cid="http://schemas.microsoft.com/office/word/2016/wordml/cid" xmlns:w16="http://schemas.microsoft.com/office/word/2018/wordml" xmlns:w16du="http://schemas.microsoft.com/office/word/2023/wordml/word16du" xmlns:w16sdtdh="http://schemas.microsoft.com/office/word/2020/wordml/sdtdatahash" xmlns:w16sdtfl="http://schemas.microsoft.com/office/word/2024/wordml/sdtformatlock" xmlns:w16se="http://schemas.microsoft.com/office/word/2015/wordml/symex" mc:Ignorable="w14 w15 w16se w16cid w16 w16cex w16sdtdh w16sdtfl w16du">
+<w:styles xmlns:mc="http://schemas.openxmlformats.org/markup-compatibility/2006" xmlns:r="http://schemas.openxmlformats.org/officeDocument/2006/relationships" xmlns:w="http://schemas.openxmlformats.org/wordprocessingml/2006/main" xmlns:w14="http://schemas.microsoft.com/office/word/2010/wordml" xmlns:w15="http://schemas.microsoft.com/office/word/2012/wordml" xmlns:w16cex="http://schemas.microsoft.com/office/word/2018/wordml/cex" xmlns:w16cid="http://schemas.microsoft.com/office/word/2016/wordml/cid" xmlns:w16="http://schemas.microsoft.com/office/word/2018/wordml" xmlns:w16sdtdh="http://schemas.microsoft.com/office/word/2020/wordml/sdtdatahash" xmlns:w16sdtfl="http://schemas.microsoft.com/office/word/2024/wordml/sdtformatlock" xmlns:w16se="http://schemas.microsoft.com/office/word/2015/wordml/symex" xmlns:w16du="http://schemas.microsoft.com/office/word/2023/wordml/word16du" mc:Ignorable="w14 w15 w16se w16cid w16 w16cex w16sdtdh w16sdtfl w16du">
   <w:docDefaults>
     <w:rPrDefault>
       <w:rPr>

</xml_diff>